<commit_message>
p11-lima modul berhasil berjalan
</commit_message>
<xml_diff>
--- a/pertemuan 11/11. Worksheet_PABW_Pertemuan11 - ID (revisi sinkron).docx
+++ b/pertemuan 11/11. Worksheet_PABW_Pertemuan11 - ID (revisi sinkron).docx
@@ -6025,6 +6025,9 @@
             <w:pPr>
               <w:spacing w:before="20" w:after="20" w:line="252" w:lineRule="auto"/>
             </w:pPr>
+            <w:r>
+              <w:t xml:space="preserve">Bersih </w:t>
+            </w:r>
           </w:p>
         </w:tc>
       </w:tr>
@@ -6094,6 +6097,9 @@
             <w:pPr>
               <w:spacing w:before="20" w:after="20" w:line="252" w:lineRule="auto"/>
             </w:pPr>
+            <w:r>
+              <w:t>Sama seperti pertemuan 10</w:t>
+            </w:r>
           </w:p>
         </w:tc>
       </w:tr>
@@ -6163,6 +6169,9 @@
             <w:pPr>
               <w:spacing w:before="20" w:after="20" w:line="252" w:lineRule="auto"/>
             </w:pPr>
+            <w:r>
+              <w:t>Sudah sesuai</w:t>
+            </w:r>
           </w:p>
         </w:tc>
       </w:tr>
@@ -6232,6 +6241,9 @@
             <w:pPr>
               <w:spacing w:before="20" w:after="20" w:line="252" w:lineRule="auto"/>
             </w:pPr>
+            <w:r>
+              <w:t>Sudah sesuai</w:t>
+            </w:r>
           </w:p>
         </w:tc>
       </w:tr>
@@ -6302,6 +6314,9 @@
             <w:pPr>
               <w:spacing w:before="20" w:after="20" w:line="252" w:lineRule="auto"/>
             </w:pPr>
+            <w:r>
+              <w:t>Ya sudah sesuai</w:t>
+            </w:r>
           </w:p>
         </w:tc>
       </w:tr>

</xml_diff>